<commit_message>
Update built site artifacts
</commit_message>
<xml_diff>
--- a/resume-full.docx
+++ b/resume-full.docx
@@ -295,6 +295,106 @@
           <w:sz w:val="22"/>
           <w:szCs w:val="22"/>
         </w:rPr>
+        <w:t xml:space="preserve">Lead IoT &amp; AI Engineer</w:t>
+      </w:r>
+      <w:r>
+        <w:t xml:space="preserve">	</w:t>
+      </w:r>
+      <w:r>
+        <w:rPr>
+          <w:color w:val="6b7280"/>
+          <w:sz w:val="16"/>
+          <w:szCs w:val="16"/>
+        </w:rPr>
+        <w:t xml:space="preserve">Mar 2025 – Present</w:t>
+      </w:r>
+    </w:p>
+    <w:p>
+      <w:pPr>
+        <w:spacing w:after="40"/>
+      </w:pPr>
+      <w:r>
+        <w:rPr>
+          <w:i/>
+          <w:iCs/>
+          <w:color w:val="374151"/>
+          <w:sz w:val="18"/>
+          <w:szCs w:val="18"/>
+        </w:rPr>
+        <w:t xml:space="preserve">PT Labtech Inovasi Indonesia, Indonesia</w:t>
+      </w:r>
+    </w:p>
+    <w:p>
+      <w:pPr>
+        <w:spacing w:after="40"/>
+      </w:pPr>
+      <w:r>
+        <w:rPr>
+          <w:color w:val="111827"/>
+          <w:sz w:val="18"/>
+          <w:szCs w:val="18"/>
+        </w:rPr>
+        <w:t xml:space="preserve">Leading IoT and AI engineering initiatives, including solution design, implementation, and technical direction for innovation projects.</w:t>
+      </w:r>
+    </w:p>
+    <w:p>
+      <w:pPr>
+        <w:pStyle w:val="ListParagraph"/>
+        <w:numPr>
+          <w:ilvl w:val="0"/>
+          <w:numId w:val="1"/>
+        </w:numPr>
+        <w:spacing w:after="30" w:before="0"/>
+        <w:ind w:left="360"/>
+      </w:pPr>
+      <w:r>
+        <w:rPr>
+          <w:color w:val="111827"/>
+          <w:sz w:val="18"/>
+          <w:szCs w:val="18"/>
+        </w:rPr>
+        <w:t xml:space="preserve">Leading end-to-end IoT and AI solution development</w:t>
+      </w:r>
+    </w:p>
+    <w:p>
+      <w:pPr>
+        <w:pStyle w:val="ListParagraph"/>
+        <w:numPr>
+          <w:ilvl w:val="0"/>
+          <w:numId w:val="1"/>
+        </w:numPr>
+        <w:spacing w:after="30" w:before="0"/>
+        <w:ind w:left="360"/>
+      </w:pPr>
+      <w:r>
+        <w:rPr>
+          <w:color w:val="111827"/>
+          <w:sz w:val="18"/>
+          <w:szCs w:val="18"/>
+        </w:rPr>
+        <w:t xml:space="preserve">Driving technical strategy and implementation for engineering projects</w:t>
+      </w:r>
+    </w:p>
+    <w:p>
+      <w:pPr>
+        <w:spacing w:after="60" w:before="0"/>
+      </w:pPr>
+    </w:p>
+    <w:p>
+      <w:pPr>
+        <w:tabs>
+          <w:tab w:val="right" w:pos="9026"/>
+        </w:tabs>
+        <w:spacing w:after="40" w:before="0"/>
+      </w:pPr>
+      <w:r>
+        <w:rPr>
+          <w:b/>
+          <w:bCs/>
+          <w:color w:val="111827"/>
+          <w:sz w:val="22"/>
+          <w:szCs w:val="22"/>
+        </w:rPr>
         <w:t xml:space="preserve">Head of Department of Software Engineering Technology</w:t>
       </w:r>
       <w:r>
@@ -1283,7 +1383,7 @@
           <w:sz w:val="16"/>
           <w:szCs w:val="16"/>
         </w:rPr>
-        <w:t xml:space="preserve">British Council  |  Feb 2025 – Feb 2027</w:t>
+        <w:t xml:space="preserve">British Council  |  Feb 2025</w:t>
       </w:r>
     </w:p>
     <w:p>
@@ -2987,7 +3087,7 @@
           <w:sz w:val="16"/>
           <w:szCs w:val="16"/>
         </w:rPr>
-        <w:t xml:space="preserve">Jurnal Ilmiah Ilmu Terapan Universitas Jambi,  Jan 2026</w:t>
+        <w:t xml:space="preserve">Jurnal Ilmiah Ilmu Terapan Universitas Jambi, 10(1), 373-389,  Jan 2026</w:t>
       </w:r>
     </w:p>
     <w:p>
@@ -4128,6 +4228,62 @@
     </w:p>
     <w:p>
       <w:pPr>
+        <w:spacing w:after="30"/>
+      </w:pPr>
+      <w:r>
+        <w:rPr>
+          <w:b/>
+          <w:bCs/>
+          <w:color w:val="111827"/>
+          <w:sz w:val="18"/>
+          <w:szCs w:val="18"/>
+        </w:rPr>
+        <w:t xml:space="preserve">AI-based Proposal Checker</w:t>
+      </w:r>
+    </w:p>
+    <w:p>
+      <w:pPr>
+        <w:spacing w:after="30"/>
+      </w:pPr>
+      <w:r>
+        <w:rPr>
+          <w:color w:val="111827"/>
+          <w:sz w:val="18"/>
+          <w:szCs w:val="18"/>
+        </w:rPr>
+        <w:t xml:space="preserve">AI-based Proposal Checker for Hackathon Competition in Bank Indonesia.</w:t>
+      </w:r>
+    </w:p>
+    <w:p>
+      <w:pPr>
+        <w:spacing w:after="40" w:before="0"/>
+      </w:pPr>
+      <w:r>
+        <w:rPr>
+          <w:b/>
+          <w:bCs/>
+          <w:color w:val="374151"/>
+          <w:sz w:val="18"/>
+          <w:szCs w:val="18"/>
+        </w:rPr>
+        <w:t xml:space="preserve">Expertise: </w:t>
+      </w:r>
+      <w:r>
+        <w:rPr>
+          <w:color w:val="6b7280"/>
+          <w:sz w:val="18"/>
+          <w:szCs w:val="18"/>
+        </w:rPr>
+        <w:t xml:space="preserve">AI, NLP, Python, Machine Learning</w:t>
+      </w:r>
+    </w:p>
+    <w:p>
+      <w:pPr>
+        <w:spacing w:after="40" w:before="0"/>
+      </w:pPr>
+    </w:p>
+    <w:p>
+      <w:pPr>
         <w:pBdr>
           <w:bottom w:val="single" w:color="e5e7eb" w:sz="4" w:space="1"/>
         </w:pBdr>
@@ -5434,6 +5590,90 @@
           <w:szCs w:val="16"/>
         </w:rPr>
         <w:t xml:space="preserve">Politeknik Negeri Cilacap</w:t>
+      </w:r>
+    </w:p>
+    <w:p>
+      <w:pPr>
+        <w:tabs>
+          <w:tab w:val="right" w:pos="9026"/>
+        </w:tabs>
+        <w:spacing w:after="40" w:before="0"/>
+      </w:pPr>
+      <w:r>
+        <w:rPr>
+          <w:b/>
+          <w:bCs/>
+          <w:color w:val="111827"/>
+          <w:sz w:val="18"/>
+          <w:szCs w:val="18"/>
+        </w:rPr>
+        <w:t xml:space="preserve">IoT, Data Science, and AI Private Teacher</w:t>
+      </w:r>
+      <w:r>
+        <w:t xml:space="preserve">	</w:t>
+      </w:r>
+      <w:r>
+        <w:rPr>
+          <w:color w:val="6b7280"/>
+          <w:sz w:val="16"/>
+          <w:szCs w:val="16"/>
+        </w:rPr>
+        <w:t xml:space="preserve">Present</w:t>
+      </w:r>
+    </w:p>
+    <w:p>
+      <w:pPr>
+        <w:spacing w:after="60"/>
+      </w:pPr>
+      <w:r>
+        <w:rPr>
+          <w:color w:val="374151"/>
+          <w:sz w:val="16"/>
+          <w:szCs w:val="16"/>
+        </w:rPr>
+        <w:t xml:space="preserve">UNSIA Student</w:t>
+      </w:r>
+    </w:p>
+    <w:p>
+      <w:pPr>
+        <w:tabs>
+          <w:tab w:val="right" w:pos="9026"/>
+        </w:tabs>
+        <w:spacing w:after="40" w:before="0"/>
+      </w:pPr>
+      <w:r>
+        <w:rPr>
+          <w:b/>
+          <w:bCs/>
+          <w:color w:val="111827"/>
+          <w:sz w:val="18"/>
+          <w:szCs w:val="18"/>
+        </w:rPr>
+        <w:t xml:space="preserve">IT Teacher for Singapore Intercultural School Student</w:t>
+      </w:r>
+      <w:r>
+        <w:t xml:space="preserve">	</w:t>
+      </w:r>
+      <w:r>
+        <w:rPr>
+          <w:color w:val="6b7280"/>
+          <w:sz w:val="16"/>
+          <w:szCs w:val="16"/>
+        </w:rPr>
+        <w:t xml:space="preserve">Present</w:t>
+      </w:r>
+    </w:p>
+    <w:p>
+      <w:pPr>
+        <w:spacing w:after="60"/>
+      </w:pPr>
+      <w:r>
+        <w:rPr>
+          <w:color w:val="374151"/>
+          <w:sz w:val="16"/>
+          <w:szCs w:val="16"/>
+        </w:rPr>
+        <w:t xml:space="preserve">Singapore Intercultural School Student</w:t>
       </w:r>
     </w:p>
     <w:sectPr>

</xml_diff>

<commit_message>
Update built site with regenerated resumes
</commit_message>
<xml_diff>
--- a/resume-full.docx
+++ b/resume-full.docx
@@ -195,7 +195,7 @@
           <w:sz w:val="22"/>
           <w:szCs w:val="22"/>
         </w:rPr>
-        <w:t xml:space="preserve">AI/ML Specialist &amp; Trainer</w:t>
+        <w:t xml:space="preserve">Lead IoT &amp; AI Engineer</w:t>
       </w:r>
       <w:r>
         <w:t xml:space="preserve">	</w:t>
@@ -206,7 +206,7 @@
           <w:sz w:val="16"/>
           <w:szCs w:val="16"/>
         </w:rPr>
-        <w:t xml:space="preserve">Jul 2025 – Oct 2025</w:t>
+        <w:t xml:space="preserve">Mar 2025 – Present</w:t>
       </w:r>
     </w:p>
     <w:p>
@@ -221,7 +221,7 @@
           <w:sz w:val="18"/>
           <w:szCs w:val="18"/>
         </w:rPr>
-        <w:t xml:space="preserve">UrbanSolv, Indonesia</w:t>
+        <w:t xml:space="preserve">PT Labtech Inovasi Indonesia, Indonesia</w:t>
       </w:r>
     </w:p>
     <w:p>
@@ -234,7 +234,7 @@
           <w:sz w:val="18"/>
           <w:szCs w:val="18"/>
         </w:rPr>
-        <w:t xml:space="preserve">Leading AI and Machine Learning initiatives, providing training and consultation on ML implementation for various projects.</w:t>
+        <w:t xml:space="preserve">Leading IoT and AI engineering initiatives, including solution design, implementation, and technical direction for innovation projects.</w:t>
       </w:r>
     </w:p>
     <w:p>
@@ -253,7 +253,7 @@
           <w:sz w:val="18"/>
           <w:szCs w:val="18"/>
         </w:rPr>
-        <w:t xml:space="preserve">Machine Learning Trainer for Kementrian PU programs</w:t>
+        <w:t xml:space="preserve">Leading end-to-end IoT and AI solution development</w:t>
       </w:r>
     </w:p>
     <w:p>
@@ -272,7 +272,7 @@
           <w:sz w:val="18"/>
           <w:szCs w:val="18"/>
         </w:rPr>
-        <w:t xml:space="preserve">Developing AI/ML solutions for urban development projects</w:t>
+        <w:t xml:space="preserve">Driving technical strategy and implementation for engineering projects</w:t>
       </w:r>
     </w:p>
     <w:p>
@@ -295,7 +295,7 @@
           <w:sz w:val="22"/>
           <w:szCs w:val="22"/>
         </w:rPr>
-        <w:t xml:space="preserve">Lead IoT &amp; AI Engineer</w:t>
+        <w:t xml:space="preserve">Head of Department of Software Engineering Technology</w:t>
       </w:r>
       <w:r>
         <w:t xml:space="preserve">	</w:t>
@@ -306,7 +306,7 @@
           <w:sz w:val="16"/>
           <w:szCs w:val="16"/>
         </w:rPr>
-        <w:t xml:space="preserve">Mar 2025 – Present</w:t>
+        <w:t xml:space="preserve">Oct 2024 – Present</w:t>
       </w:r>
     </w:p>
     <w:p>
@@ -321,7 +321,7 @@
           <w:sz w:val="18"/>
           <w:szCs w:val="18"/>
         </w:rPr>
-        <w:t xml:space="preserve">PT Labtech Inovasi Indonesia, Indonesia</w:t>
+        <w:t xml:space="preserve">Akademi Digital Bandung, Bandung, Indonesia</w:t>
       </w:r>
     </w:p>
     <w:p>
@@ -334,7 +334,7 @@
           <w:sz w:val="18"/>
           <w:szCs w:val="18"/>
         </w:rPr>
-        <w:t xml:space="preserve">Leading IoT and AI engineering initiatives, including solution design, implementation, and technical direction for innovation projects.</w:t>
+        <w:t xml:space="preserve">Leading Software Engineering Technology department, developing curriculum and training programs for digital skills education.</w:t>
       </w:r>
     </w:p>
     <w:p>
@@ -353,7 +353,7 @@
           <w:sz w:val="18"/>
           <w:szCs w:val="18"/>
         </w:rPr>
-        <w:t xml:space="preserve">Leading end-to-end IoT and AI solution development</w:t>
+        <w:t xml:space="preserve">Leading software engineering education initiatives</w:t>
       </w:r>
     </w:p>
     <w:p>
@@ -372,7 +372,26 @@
           <w:sz w:val="18"/>
           <w:szCs w:val="18"/>
         </w:rPr>
-        <w:t xml:space="preserve">Driving technical strategy and implementation for engineering projects</w:t>
+        <w:t xml:space="preserve">Organizing workshops on Competitive Programming and AI</w:t>
+      </w:r>
+    </w:p>
+    <w:p>
+      <w:pPr>
+        <w:pStyle w:val="ListParagraph"/>
+        <w:numPr>
+          <w:ilvl w:val="0"/>
+          <w:numId w:val="1"/>
+        </w:numPr>
+        <w:spacing w:after="30" w:before="0"/>
+        <w:ind w:left="360"/>
+      </w:pPr>
+      <w:r>
+        <w:rPr>
+          <w:color w:val="111827"/>
+          <w:sz w:val="18"/>
+          <w:szCs w:val="18"/>
+        </w:rPr>
+        <w:t xml:space="preserve">Community engagement through BOOST YOUR BUSINESS programs</w:t>
       </w:r>
     </w:p>
     <w:p>
@@ -395,7 +414,7 @@
           <w:sz w:val="22"/>
           <w:szCs w:val="22"/>
         </w:rPr>
-        <w:t xml:space="preserve">Head of Department of Software Engineering Technology</w:t>
+        <w:t xml:space="preserve">AI/ML Specialist &amp; Trainer</w:t>
       </w:r>
       <w:r>
         <w:t xml:space="preserve">	</w:t>
@@ -406,7 +425,7 @@
           <w:sz w:val="16"/>
           <w:szCs w:val="16"/>
         </w:rPr>
-        <w:t xml:space="preserve">Oct 2024 – Present</w:t>
+        <w:t xml:space="preserve">Jul 2025 – Oct 2025</w:t>
       </w:r>
     </w:p>
     <w:p>
@@ -421,7 +440,7 @@
           <w:sz w:val="18"/>
           <w:szCs w:val="18"/>
         </w:rPr>
-        <w:t xml:space="preserve">Akademi Digital Bandung, Bandung, Indonesia</w:t>
+        <w:t xml:space="preserve">UrbanSolv, Indonesia</w:t>
       </w:r>
     </w:p>
     <w:p>
@@ -434,7 +453,7 @@
           <w:sz w:val="18"/>
           <w:szCs w:val="18"/>
         </w:rPr>
-        <w:t xml:space="preserve">Leading Software Engineering Technology department, developing curriculum and training programs for digital skills education.</w:t>
+        <w:t xml:space="preserve">Leading AI and Machine Learning initiatives, providing training and consultation on ML implementation for various projects.</w:t>
       </w:r>
     </w:p>
     <w:p>
@@ -453,7 +472,7 @@
           <w:sz w:val="18"/>
           <w:szCs w:val="18"/>
         </w:rPr>
-        <w:t xml:space="preserve">Leading software engineering education initiatives</w:t>
+        <w:t xml:space="preserve">Machine Learning Trainer for Kementrian PU programs</w:t>
       </w:r>
     </w:p>
     <w:p>
@@ -472,26 +491,7 @@
           <w:sz w:val="18"/>
           <w:szCs w:val="18"/>
         </w:rPr>
-        <w:t xml:space="preserve">Organizing workshops on Competitive Programming and AI</w:t>
-      </w:r>
-    </w:p>
-    <w:p>
-      <w:pPr>
-        <w:pStyle w:val="ListParagraph"/>
-        <w:numPr>
-          <w:ilvl w:val="0"/>
-          <w:numId w:val="1"/>
-        </w:numPr>
-        <w:spacing w:after="30" w:before="0"/>
-        <w:ind w:left="360"/>
-      </w:pPr>
-      <w:r>
-        <w:rPr>
-          <w:color w:val="111827"/>
-          <w:sz w:val="18"/>
-          <w:szCs w:val="18"/>
-        </w:rPr>
-        <w:t xml:space="preserve">Community engagement through BOOST YOUR BUSINESS programs</w:t>
+        <w:t xml:space="preserve">Developing AI/ML solutions for urban development projects</w:t>
       </w:r>
     </w:p>
     <w:p>
@@ -3454,6 +3454,174 @@
           <w:sz w:val="18"/>
           <w:szCs w:val="18"/>
         </w:rPr>
+        <w:t xml:space="preserve">Invoice Generated</w:t>
+      </w:r>
+    </w:p>
+    <w:p>
+      <w:pPr>
+        <w:spacing w:after="30"/>
+      </w:pPr>
+      <w:r>
+        <w:rPr>
+          <w:color w:val="111827"/>
+          <w:sz w:val="18"/>
+          <w:szCs w:val="18"/>
+        </w:rPr>
+        <w:t xml:space="preserve">AI-powered invoice generation platform built with React, Hono, and Cloudflare.</w:t>
+      </w:r>
+    </w:p>
+    <w:p>
+      <w:pPr>
+        <w:spacing w:after="40" w:before="0"/>
+      </w:pPr>
+      <w:r>
+        <w:rPr>
+          <w:b/>
+          <w:bCs/>
+          <w:color w:val="374151"/>
+          <w:sz w:val="18"/>
+          <w:szCs w:val="18"/>
+        </w:rPr>
+        <w:t xml:space="preserve">Expertise: </w:t>
+      </w:r>
+      <w:r>
+        <w:rPr>
+          <w:color w:val="6b7280"/>
+          <w:sz w:val="18"/>
+          <w:szCs w:val="18"/>
+        </w:rPr>
+        <w:t xml:space="preserve">React, Hono, Cloudflare Pages, Cloudflare Workers, AI Integration</w:t>
+      </w:r>
+    </w:p>
+    <w:p>
+      <w:pPr>
+        <w:spacing w:after="40" w:before="0"/>
+      </w:pPr>
+    </w:p>
+    <w:p>
+      <w:pPr>
+        <w:spacing w:after="30"/>
+      </w:pPr>
+      <w:r>
+        <w:rPr>
+          <w:b/>
+          <w:bCs/>
+          <w:color w:val="111827"/>
+          <w:sz w:val="18"/>
+          <w:szCs w:val="18"/>
+        </w:rPr>
+        <w:t xml:space="preserve">AI-based Proposal Checker</w:t>
+      </w:r>
+    </w:p>
+    <w:p>
+      <w:pPr>
+        <w:spacing w:after="30"/>
+      </w:pPr>
+      <w:r>
+        <w:rPr>
+          <w:color w:val="111827"/>
+          <w:sz w:val="18"/>
+          <w:szCs w:val="18"/>
+        </w:rPr>
+        <w:t xml:space="preserve">AI-based Proposal Checker for Hackathon Competition in Bank Indonesia.</w:t>
+      </w:r>
+    </w:p>
+    <w:p>
+      <w:pPr>
+        <w:spacing w:after="40" w:before="0"/>
+      </w:pPr>
+      <w:r>
+        <w:rPr>
+          <w:b/>
+          <w:bCs/>
+          <w:color w:val="374151"/>
+          <w:sz w:val="18"/>
+          <w:szCs w:val="18"/>
+        </w:rPr>
+        <w:t xml:space="preserve">Expertise: </w:t>
+      </w:r>
+      <w:r>
+        <w:rPr>
+          <w:color w:val="6b7280"/>
+          <w:sz w:val="18"/>
+          <w:szCs w:val="18"/>
+        </w:rPr>
+        <w:t xml:space="preserve">AI, NLP, Python, Machine Learning</w:t>
+      </w:r>
+    </w:p>
+    <w:p>
+      <w:pPr>
+        <w:spacing w:after="40" w:before="0"/>
+      </w:pPr>
+    </w:p>
+    <w:p>
+      <w:pPr>
+        <w:spacing w:after="30"/>
+      </w:pPr>
+      <w:r>
+        <w:rPr>
+          <w:b/>
+          <w:bCs/>
+          <w:color w:val="111827"/>
+          <w:sz w:val="18"/>
+          <w:szCs w:val="18"/>
+        </w:rPr>
+        <w:t xml:space="preserve">MHoney Website</w:t>
+      </w:r>
+    </w:p>
+    <w:p>
+      <w:pPr>
+        <w:spacing w:after="30"/>
+      </w:pPr>
+      <w:r>
+        <w:rPr>
+          <w:color w:val="111827"/>
+          <w:sz w:val="18"/>
+          <w:szCs w:val="18"/>
+        </w:rPr>
+        <w:t xml:space="preserve">Web application for MHoney (mhoney.id) built with React and Tailwind CSS.</w:t>
+      </w:r>
+    </w:p>
+    <w:p>
+      <w:pPr>
+        <w:spacing w:after="40" w:before="0"/>
+      </w:pPr>
+      <w:r>
+        <w:rPr>
+          <w:b/>
+          <w:bCs/>
+          <w:color w:val="374151"/>
+          <w:sz w:val="18"/>
+          <w:szCs w:val="18"/>
+        </w:rPr>
+        <w:t xml:space="preserve">Expertise: </w:t>
+      </w:r>
+      <w:r>
+        <w:rPr>
+          <w:color w:val="6b7280"/>
+          <w:sz w:val="18"/>
+          <w:szCs w:val="18"/>
+        </w:rPr>
+        <w:t xml:space="preserve">React, Tailwind CSS, SEO, Google Analytics</w:t>
+      </w:r>
+    </w:p>
+    <w:p>
+      <w:pPr>
+        <w:spacing w:after="40" w:before="0"/>
+      </w:pPr>
+    </w:p>
+    <w:p>
+      <w:pPr>
+        <w:spacing w:after="30"/>
+      </w:pPr>
+      <w:r>
+        <w:rPr>
+          <w:b/>
+          <w:bCs/>
+          <w:color w:val="111827"/>
+          <w:sz w:val="18"/>
+          <w:szCs w:val="18"/>
+        </w:rPr>
         <w:t xml:space="preserve">RFID-based Student Attendance Platform</w:t>
       </w:r>
     </w:p>
@@ -3902,6 +4070,62 @@
           <w:sz w:val="18"/>
           <w:szCs w:val="18"/>
         </w:rPr>
+        <w:t xml:space="preserve">Harvest Moon Game Replica with Java</w:t>
+      </w:r>
+    </w:p>
+    <w:p>
+      <w:pPr>
+        <w:spacing w:after="30"/>
+      </w:pPr>
+      <w:r>
+        <w:rPr>
+          <w:color w:val="111827"/>
+          <w:sz w:val="18"/>
+          <w:szCs w:val="18"/>
+        </w:rPr>
+        <w:t xml:space="preserve">Develop replica of Harvest Moon game using Java programming.</w:t>
+      </w:r>
+    </w:p>
+    <w:p>
+      <w:pPr>
+        <w:spacing w:after="40" w:before="0"/>
+      </w:pPr>
+      <w:r>
+        <w:rPr>
+          <w:b/>
+          <w:bCs/>
+          <w:color w:val="374151"/>
+          <w:sz w:val="18"/>
+          <w:szCs w:val="18"/>
+        </w:rPr>
+        <w:t xml:space="preserve">Expertise: </w:t>
+      </w:r>
+      <w:r>
+        <w:rPr>
+          <w:color w:val="6b7280"/>
+          <w:sz w:val="18"/>
+          <w:szCs w:val="18"/>
+        </w:rPr>
+        <w:t xml:space="preserve">Java, OOP, Game Development</w:t>
+      </w:r>
+    </w:p>
+    <w:p>
+      <w:pPr>
+        <w:spacing w:after="40" w:before="0"/>
+      </w:pPr>
+    </w:p>
+    <w:p>
+      <w:pPr>
+        <w:spacing w:after="30"/>
+      </w:pPr>
+      <w:r>
+        <w:rPr>
+          <w:b/>
+          <w:bCs/>
+          <w:color w:val="111827"/>
+          <w:sz w:val="18"/>
+          <w:szCs w:val="18"/>
+        </w:rPr>
         <w:t xml:space="preserve">Student Monitoring System for Salman Al-Farisi Primary School</w:t>
       </w:r>
     </w:p>
@@ -4014,20 +4238,20 @@
           <w:sz w:val="18"/>
           <w:szCs w:val="18"/>
         </w:rPr>
-        <w:t xml:space="preserve">Harvest Moon Game Replica with Java</w:t>
-      </w:r>
-    </w:p>
-    <w:p>
-      <w:pPr>
-        <w:spacing w:after="30"/>
-      </w:pPr>
-      <w:r>
-        <w:rPr>
-          <w:color w:val="111827"/>
-          <w:sz w:val="18"/>
-          <w:szCs w:val="18"/>
-        </w:rPr>
-        <w:t xml:space="preserve">Develop replica of Harvest Moon game using Java programming.</w:t>
+        <w:t xml:space="preserve">Flight Database Management System</w:t>
+      </w:r>
+    </w:p>
+    <w:p>
+      <w:pPr>
+        <w:spacing w:after="30"/>
+      </w:pPr>
+      <w:r>
+        <w:rPr>
+          <w:color w:val="111827"/>
+          <w:sz w:val="18"/>
+          <w:szCs w:val="18"/>
+        </w:rPr>
+        <w:t xml:space="preserve">Designing flight database management system for airline operations.</w:t>
       </w:r>
     </w:p>
     <w:p>
@@ -4050,231 +4274,7 @@
           <w:sz w:val="18"/>
           <w:szCs w:val="18"/>
         </w:rPr>
-        <w:t xml:space="preserve">Java, OOP, Game Development</w:t>
-      </w:r>
-    </w:p>
-    <w:p>
-      <w:pPr>
-        <w:spacing w:after="40" w:before="0"/>
-      </w:pPr>
-    </w:p>
-    <w:p>
-      <w:pPr>
-        <w:spacing w:after="30"/>
-      </w:pPr>
-      <w:r>
-        <w:rPr>
-          <w:b/>
-          <w:bCs/>
-          <w:color w:val="111827"/>
-          <w:sz w:val="18"/>
-          <w:szCs w:val="18"/>
-        </w:rPr>
-        <w:t xml:space="preserve">Flight Database Management System</w:t>
-      </w:r>
-    </w:p>
-    <w:p>
-      <w:pPr>
-        <w:spacing w:after="30"/>
-      </w:pPr>
-      <w:r>
-        <w:rPr>
-          <w:color w:val="111827"/>
-          <w:sz w:val="18"/>
-          <w:szCs w:val="18"/>
-        </w:rPr>
-        <w:t xml:space="preserve">Designing flight database management system for airline operations.</w:t>
-      </w:r>
-    </w:p>
-    <w:p>
-      <w:pPr>
-        <w:spacing w:after="40" w:before="0"/>
-      </w:pPr>
-      <w:r>
-        <w:rPr>
-          <w:b/>
-          <w:bCs/>
-          <w:color w:val="374151"/>
-          <w:sz w:val="18"/>
-          <w:szCs w:val="18"/>
-        </w:rPr>
-        <w:t xml:space="preserve">Expertise: </w:t>
-      </w:r>
-      <w:r>
-        <w:rPr>
-          <w:color w:val="6b7280"/>
-          <w:sz w:val="18"/>
-          <w:szCs w:val="18"/>
-        </w:rPr>
         <w:t xml:space="preserve">Database Design, SQL, Data Modeling, ERD</w:t>
-      </w:r>
-    </w:p>
-    <w:p>
-      <w:pPr>
-        <w:spacing w:after="40" w:before="0"/>
-      </w:pPr>
-    </w:p>
-    <w:p>
-      <w:pPr>
-        <w:spacing w:after="30"/>
-      </w:pPr>
-      <w:r>
-        <w:rPr>
-          <w:b/>
-          <w:bCs/>
-          <w:color w:val="111827"/>
-          <w:sz w:val="18"/>
-          <w:szCs w:val="18"/>
-        </w:rPr>
-        <w:t xml:space="preserve">MHoney Website</w:t>
-      </w:r>
-    </w:p>
-    <w:p>
-      <w:pPr>
-        <w:spacing w:after="30"/>
-      </w:pPr>
-      <w:r>
-        <w:rPr>
-          <w:color w:val="111827"/>
-          <w:sz w:val="18"/>
-          <w:szCs w:val="18"/>
-        </w:rPr>
-        <w:t xml:space="preserve">Web application for MHoney (mhoney.id) built with React and Tailwind CSS.</w:t>
-      </w:r>
-    </w:p>
-    <w:p>
-      <w:pPr>
-        <w:spacing w:after="40" w:before="0"/>
-      </w:pPr>
-      <w:r>
-        <w:rPr>
-          <w:b/>
-          <w:bCs/>
-          <w:color w:val="374151"/>
-          <w:sz w:val="18"/>
-          <w:szCs w:val="18"/>
-        </w:rPr>
-        <w:t xml:space="preserve">Expertise: </w:t>
-      </w:r>
-      <w:r>
-        <w:rPr>
-          <w:color w:val="6b7280"/>
-          <w:sz w:val="18"/>
-          <w:szCs w:val="18"/>
-        </w:rPr>
-        <w:t xml:space="preserve">React, Tailwind CSS, SEO, Google Analytics</w:t>
-      </w:r>
-    </w:p>
-    <w:p>
-      <w:pPr>
-        <w:spacing w:after="40" w:before="0"/>
-      </w:pPr>
-    </w:p>
-    <w:p>
-      <w:pPr>
-        <w:spacing w:after="30"/>
-      </w:pPr>
-      <w:r>
-        <w:rPr>
-          <w:b/>
-          <w:bCs/>
-          <w:color w:val="111827"/>
-          <w:sz w:val="18"/>
-          <w:szCs w:val="18"/>
-        </w:rPr>
-        <w:t xml:space="preserve">Invoice Generated</w:t>
-      </w:r>
-    </w:p>
-    <w:p>
-      <w:pPr>
-        <w:spacing w:after="30"/>
-      </w:pPr>
-      <w:r>
-        <w:rPr>
-          <w:color w:val="111827"/>
-          <w:sz w:val="18"/>
-          <w:szCs w:val="18"/>
-        </w:rPr>
-        <w:t xml:space="preserve">AI-powered invoice generation platform built with React, Hono, and Cloudflare.</w:t>
-      </w:r>
-    </w:p>
-    <w:p>
-      <w:pPr>
-        <w:spacing w:after="40" w:before="0"/>
-      </w:pPr>
-      <w:r>
-        <w:rPr>
-          <w:b/>
-          <w:bCs/>
-          <w:color w:val="374151"/>
-          <w:sz w:val="18"/>
-          <w:szCs w:val="18"/>
-        </w:rPr>
-        <w:t xml:space="preserve">Expertise: </w:t>
-      </w:r>
-      <w:r>
-        <w:rPr>
-          <w:color w:val="6b7280"/>
-          <w:sz w:val="18"/>
-          <w:szCs w:val="18"/>
-        </w:rPr>
-        <w:t xml:space="preserve">React, Hono, Cloudflare Pages, Cloudflare Workers, AI Integration</w:t>
-      </w:r>
-    </w:p>
-    <w:p>
-      <w:pPr>
-        <w:spacing w:after="40" w:before="0"/>
-      </w:pPr>
-    </w:p>
-    <w:p>
-      <w:pPr>
-        <w:spacing w:after="30"/>
-      </w:pPr>
-      <w:r>
-        <w:rPr>
-          <w:b/>
-          <w:bCs/>
-          <w:color w:val="111827"/>
-          <w:sz w:val="18"/>
-          <w:szCs w:val="18"/>
-        </w:rPr>
-        <w:t xml:space="preserve">AI-based Proposal Checker</w:t>
-      </w:r>
-    </w:p>
-    <w:p>
-      <w:pPr>
-        <w:spacing w:after="30"/>
-      </w:pPr>
-      <w:r>
-        <w:rPr>
-          <w:color w:val="111827"/>
-          <w:sz w:val="18"/>
-          <w:szCs w:val="18"/>
-        </w:rPr>
-        <w:t xml:space="preserve">AI-based Proposal Checker for Hackathon Competition in Bank Indonesia.</w:t>
-      </w:r>
-    </w:p>
-    <w:p>
-      <w:pPr>
-        <w:spacing w:after="40" w:before="0"/>
-      </w:pPr>
-      <w:r>
-        <w:rPr>
-          <w:b/>
-          <w:bCs/>
-          <w:color w:val="374151"/>
-          <w:sz w:val="18"/>
-          <w:szCs w:val="18"/>
-        </w:rPr>
-        <w:t xml:space="preserve">Expertise: </w:t>
-      </w:r>
-      <w:r>
-        <w:rPr>
-          <w:color w:val="6b7280"/>
-          <w:sz w:val="18"/>
-          <w:szCs w:val="18"/>
-        </w:rPr>
-        <w:t xml:space="preserve">AI, NLP, Python, Machine Learning</w:t>
       </w:r>
     </w:p>
     <w:p>
@@ -4312,7 +4312,7 @@
           <w:sz w:val="18"/>
           <w:szCs w:val="18"/>
         </w:rPr>
-        <w:t xml:space="preserve">2nd Winner of Business IT-Case Competition</w:t>
+        <w:t xml:space="preserve">Silver Prize - Engineering Solution Contest</w:t>
       </w:r>
     </w:p>
     <w:p>
@@ -4327,22 +4327,22 @@
           <w:sz w:val="16"/>
           <w:szCs w:val="16"/>
         </w:rPr>
-        <w:t xml:space="preserve">Techphoria Event  |  Universitas Sriwijaya  |  National  |  Oct 2017</w:t>
-      </w:r>
-    </w:p>
-    <w:p>
-      <w:pPr>
-        <w:spacing w:after="30"/>
-      </w:pPr>
-      <w:r>
-        <w:rPr>
-          <w:b/>
-          <w:bCs/>
-          <w:color w:val="111827"/>
-          <w:sz w:val="18"/>
-          <w:szCs w:val="18"/>
-        </w:rPr>
-        <w:t xml:space="preserve">Silver Prize - Engineering Solution Contest</w:t>
+        <w:t xml:space="preserve">d-Camp 2018  |  Innovation Hub Center for Engineering Education (IHCEE) Chonbuk National University  |  International  |  Aug 2018</w:t>
+      </w:r>
+    </w:p>
+    <w:p>
+      <w:pPr>
+        <w:spacing w:after="30"/>
+      </w:pPr>
+      <w:r>
+        <w:rPr>
+          <w:b/>
+          <w:bCs/>
+          <w:color w:val="111827"/>
+          <w:sz w:val="18"/>
+          <w:szCs w:val="18"/>
+        </w:rPr>
+        <w:t xml:space="preserve">Participant Prize - i-CAPS 2018</w:t>
       </w:r>
     </w:p>
     <w:p>
@@ -4357,22 +4357,22 @@
           <w:sz w:val="16"/>
           <w:szCs w:val="16"/>
         </w:rPr>
-        <w:t xml:space="preserve">d-Camp 2018  |  Innovation Hub Center for Engineering Education (IHCEE) Chonbuk National University  |  International  |  Aug 2018</w:t>
-      </w:r>
-    </w:p>
-    <w:p>
-      <w:pPr>
-        <w:spacing w:after="30"/>
-      </w:pPr>
-      <w:r>
-        <w:rPr>
-          <w:b/>
-          <w:bCs/>
-          <w:color w:val="111827"/>
-          <w:sz w:val="18"/>
-          <w:szCs w:val="18"/>
-        </w:rPr>
-        <w:t xml:space="preserve">Participant Prize - i-CAPS 2018</w:t>
+        <w:t xml:space="preserve">International Students Joint Capstone Design Project Competition  |  Innovation Hub Center for Engineering Education (IHCEE) Chonbuk National University  |  International  |  Aug 2018</w:t>
+      </w:r>
+    </w:p>
+    <w:p>
+      <w:pPr>
+        <w:spacing w:after="30"/>
+      </w:pPr>
+      <w:r>
+        <w:rPr>
+          <w:b/>
+          <w:bCs/>
+          <w:color w:val="111827"/>
+          <w:sz w:val="18"/>
+          <w:szCs w:val="18"/>
+        </w:rPr>
+        <w:t xml:space="preserve">2nd Winner of Business IT-Case Competition</w:t>
       </w:r>
     </w:p>
     <w:p>
@@ -4387,7 +4387,7 @@
           <w:sz w:val="16"/>
           <w:szCs w:val="16"/>
         </w:rPr>
-        <w:t xml:space="preserve">International Students Joint Capstone Design Project Competition  |  Innovation Hub Center for Engineering Education (IHCEE) Chonbuk National University  |  International  |  Aug 2018</w:t>
+        <w:t xml:space="preserve">Techphoria Event  |  Universitas Sriwijaya  |  National  |  Oct 2017</w:t>
       </w:r>
     </w:p>
     <w:p>
@@ -4599,7 +4599,7 @@
           <w:sz w:val="18"/>
           <w:szCs w:val="18"/>
         </w:rPr>
-        <w:t xml:space="preserve">IoT Instructor</w:t>
+        <w:t xml:space="preserve">IT Teacher for Singapore Intercultural School Student</w:t>
       </w:r>
       <w:r>
         <w:t xml:space="preserve">	</w:t>
@@ -4610,7 +4610,7 @@
           <w:sz w:val="16"/>
           <w:szCs w:val="16"/>
         </w:rPr>
-        <w:t xml:space="preserve">Oct 2025</w:t>
+        <w:t xml:space="preserve">Apr 2026 – Present</w:t>
       </w:r>
     </w:p>
     <w:p>
@@ -4623,7 +4623,7 @@
           <w:sz w:val="16"/>
           <w:szCs w:val="16"/>
         </w:rPr>
-        <w:t xml:space="preserve">Samsung Innovation Campus x dibimbing.id</w:t>
+        <w:t xml:space="preserve">Singapore Intercultural School Student</w:t>
       </w:r>
     </w:p>
     <w:p>
@@ -4641,7 +4641,7 @@
           <w:sz w:val="18"/>
           <w:szCs w:val="18"/>
         </w:rPr>
-        <w:t xml:space="preserve">IoT Mentor</w:t>
+        <w:t xml:space="preserve">IoT, Data Science, and AI Private Teacher</w:t>
       </w:r>
       <w:r>
         <w:t xml:space="preserve">	</w:t>
@@ -4652,7 +4652,7 @@
           <w:sz w:val="16"/>
           <w:szCs w:val="16"/>
         </w:rPr>
-        <w:t xml:space="preserve">Sep 2025</w:t>
+        <w:t xml:space="preserve">Feb 2026 – May 2026</w:t>
       </w:r>
     </w:p>
     <w:p>
@@ -4665,7 +4665,7 @@
           <w:sz w:val="16"/>
           <w:szCs w:val="16"/>
         </w:rPr>
-        <w:t xml:space="preserve">Samsung Innovation Campus x dibimbing.id</w:t>
+        <w:t xml:space="preserve">UNSIA Student</w:t>
       </w:r>
     </w:p>
     <w:p>
@@ -4683,7 +4683,7 @@
           <w:sz w:val="18"/>
           <w:szCs w:val="18"/>
         </w:rPr>
-        <w:t xml:space="preserve">Speaker at Workshop AI &amp; Data Science</w:t>
+        <w:t xml:space="preserve">IoT Instructor</w:t>
       </w:r>
       <w:r>
         <w:t xml:space="preserve">	</w:t>
@@ -4694,7 +4694,7 @@
           <w:sz w:val="16"/>
           <w:szCs w:val="16"/>
         </w:rPr>
-        <w:t xml:space="preserve">Aug 2025</w:t>
+        <w:t xml:space="preserve">Oct 2025</w:t>
       </w:r>
     </w:p>
     <w:p>
@@ -4707,7 +4707,7 @@
           <w:sz w:val="16"/>
           <w:szCs w:val="16"/>
         </w:rPr>
-        <w:t xml:space="preserve">Pengmas Akademi Digital Bandung</w:t>
+        <w:t xml:space="preserve">Samsung Innovation Campus x dibimbing.id</w:t>
       </w:r>
     </w:p>
     <w:p>
@@ -4725,7 +4725,7 @@
           <w:sz w:val="18"/>
           <w:szCs w:val="18"/>
         </w:rPr>
-        <w:t xml:space="preserve">Speaker at AI and IoT Webinar</w:t>
+        <w:t xml:space="preserve">FGD Speaker: Fundamental AI and IoT</w:t>
       </w:r>
       <w:r>
         <w:t xml:space="preserve">	</w:t>
@@ -4736,7 +4736,7 @@
           <w:sz w:val="16"/>
           <w:szCs w:val="16"/>
         </w:rPr>
-        <w:t xml:space="preserve">Aug 2025</w:t>
+        <w:t xml:space="preserve">Oct 2025</w:t>
       </w:r>
     </w:p>
     <w:p>
@@ -4749,7 +4749,7 @@
           <w:sz w:val="16"/>
           <w:szCs w:val="16"/>
         </w:rPr>
-        <w:t xml:space="preserve">Samsung Innovation Campus x dibimbing.id</w:t>
+        <w:t xml:space="preserve">Politeknik Negeri Cilacap</w:t>
       </w:r>
     </w:p>
     <w:p>
@@ -4767,7 +4767,7 @@
           <w:sz w:val="18"/>
           <w:szCs w:val="18"/>
         </w:rPr>
-        <w:t xml:space="preserve">Machine Learning Trainer</w:t>
+        <w:t xml:space="preserve">IoT Mentor</w:t>
       </w:r>
       <w:r>
         <w:t xml:space="preserve">	</w:t>
@@ -4778,7 +4778,7 @@
           <w:sz w:val="16"/>
           <w:szCs w:val="16"/>
         </w:rPr>
-        <w:t xml:space="preserve">Jul 2025</w:t>
+        <w:t xml:space="preserve">Sep 2025</w:t>
       </w:r>
     </w:p>
     <w:p>
@@ -4791,7 +4791,7 @@
           <w:sz w:val="16"/>
           <w:szCs w:val="16"/>
         </w:rPr>
-        <w:t xml:space="preserve">Kementrian PU x UrbanSolv</w:t>
+        <w:t xml:space="preserve">Samsung Innovation Campus x dibimbing.id</w:t>
       </w:r>
     </w:p>
     <w:p>
@@ -4809,7 +4809,7 @@
           <w:sz w:val="18"/>
           <w:szCs w:val="18"/>
         </w:rPr>
-        <w:t xml:space="preserve">IoT Workshop Trainer</w:t>
+        <w:t xml:space="preserve">Speaker at Workshop AI &amp; Data Science</w:t>
       </w:r>
       <w:r>
         <w:t xml:space="preserve">	</w:t>
@@ -4820,7 +4820,7 @@
           <w:sz w:val="16"/>
           <w:szCs w:val="16"/>
         </w:rPr>
-        <w:t xml:space="preserve">Jun 2025</w:t>
+        <w:t xml:space="preserve">Aug 2025</w:t>
       </w:r>
     </w:p>
     <w:p>
@@ -4833,7 +4833,7 @@
           <w:sz w:val="16"/>
           <w:szCs w:val="16"/>
         </w:rPr>
-        <w:t xml:space="preserve">Kementrian Ketenagakerjaan x dibimbing.id</w:t>
+        <w:t xml:space="preserve">Pengmas Akademi Digital Bandung</w:t>
       </w:r>
     </w:p>
     <w:p>
@@ -4851,7 +4851,7 @@
           <w:sz w:val="18"/>
           <w:szCs w:val="18"/>
         </w:rPr>
-        <w:t xml:space="preserve">Private IoT and Data Science Teacher</w:t>
+        <w:t xml:space="preserve">Speaker at AI and IoT Webinar</w:t>
       </w:r>
       <w:r>
         <w:t xml:space="preserve">	</w:t>
@@ -4862,7 +4862,7 @@
           <w:sz w:val="16"/>
           <w:szCs w:val="16"/>
         </w:rPr>
-        <w:t xml:space="preserve">May 2025</w:t>
+        <w:t xml:space="preserve">Aug 2025</w:t>
       </w:r>
     </w:p>
     <w:p>
@@ -4875,7 +4875,7 @@
           <w:sz w:val="16"/>
           <w:szCs w:val="16"/>
         </w:rPr>
-        <w:t xml:space="preserve">UNSIA Student</w:t>
+        <w:t xml:space="preserve">Samsung Innovation Campus x dibimbing.id</w:t>
       </w:r>
     </w:p>
     <w:p>
@@ -4893,7 +4893,7 @@
           <w:sz w:val="18"/>
           <w:szCs w:val="18"/>
         </w:rPr>
-        <w:t xml:space="preserve">Competitive Programming Workshop Trainer</w:t>
+        <w:t xml:space="preserve">Machine Learning Trainer</w:t>
       </w:r>
       <w:r>
         <w:t xml:space="preserve">	</w:t>
@@ -4904,7 +4904,7 @@
           <w:sz w:val="16"/>
           <w:szCs w:val="16"/>
         </w:rPr>
-        <w:t xml:space="preserve">Mar 2025</w:t>
+        <w:t xml:space="preserve">Jul 2025</w:t>
       </w:r>
     </w:p>
     <w:p>
@@ -4917,7 +4917,7 @@
           <w:sz w:val="16"/>
           <w:szCs w:val="16"/>
         </w:rPr>
-        <w:t xml:space="preserve">Akademi Digital Bandung</w:t>
+        <w:t xml:space="preserve">Kementrian PU x UrbanSolv</w:t>
       </w:r>
     </w:p>
     <w:p>
@@ -4935,7 +4935,7 @@
           <w:sz w:val="18"/>
           <w:szCs w:val="18"/>
         </w:rPr>
-        <w:t xml:space="preserve">Basic Programming Workshop Trainer</w:t>
+        <w:t xml:space="preserve">IoT Workshop Trainer</w:t>
       </w:r>
       <w:r>
         <w:t xml:space="preserve">	</w:t>
@@ -4946,7 +4946,7 @@
           <w:sz w:val="16"/>
           <w:szCs w:val="16"/>
         </w:rPr>
-        <w:t xml:space="preserve">Mar 2025</w:t>
+        <w:t xml:space="preserve">Jun 2025</w:t>
       </w:r>
     </w:p>
     <w:p>
@@ -4959,7 +4959,7 @@
           <w:sz w:val="16"/>
           <w:szCs w:val="16"/>
         </w:rPr>
-        <w:t xml:space="preserve">Personal Charity Project</w:t>
+        <w:t xml:space="preserve">Kementrian Ketenagakerjaan x dibimbing.id</w:t>
       </w:r>
     </w:p>
     <w:p>
@@ -4977,7 +4977,7 @@
           <w:sz w:val="18"/>
           <w:szCs w:val="18"/>
         </w:rPr>
-        <w:t xml:space="preserve">Speaker at BOOST YOUR BUSINESS: AI UNTUK UMKM NAIK KELAS</w:t>
+        <w:t xml:space="preserve">Private IoT and Data Science Teacher</w:t>
       </w:r>
       <w:r>
         <w:t xml:space="preserve">	</w:t>
@@ -4988,7 +4988,7 @@
           <w:sz w:val="16"/>
           <w:szCs w:val="16"/>
         </w:rPr>
-        <w:t xml:space="preserve">Dec 2024</w:t>
+        <w:t xml:space="preserve">May 2025</w:t>
       </w:r>
     </w:p>
     <w:p>
@@ -5001,7 +5001,7 @@
           <w:sz w:val="16"/>
           <w:szCs w:val="16"/>
         </w:rPr>
-        <w:t xml:space="preserve">Pengmas Akademi Digital Bandung</w:t>
+        <w:t xml:space="preserve">UNSIA Student</w:t>
       </w:r>
     </w:p>
     <w:p>
@@ -5019,7 +5019,7 @@
           <w:sz w:val="18"/>
           <w:szCs w:val="18"/>
         </w:rPr>
-        <w:t xml:space="preserve">Conference Moderator</w:t>
+        <w:t xml:space="preserve">Competitive Programming Workshop Trainer</w:t>
       </w:r>
       <w:r>
         <w:t xml:space="preserve">	</w:t>
@@ -5030,7 +5030,7 @@
           <w:sz w:val="16"/>
           <w:szCs w:val="16"/>
         </w:rPr>
-        <w:t xml:space="preserve">Sep 2024</w:t>
+        <w:t xml:space="preserve">Mar 2025</w:t>
       </w:r>
     </w:p>
     <w:p>
@@ -5043,7 +5043,7 @@
           <w:sz w:val="16"/>
           <w:szCs w:val="16"/>
         </w:rPr>
-        <w:t xml:space="preserve">International Conference on ICT for Smart Society by ITB</w:t>
+        <w:t xml:space="preserve">Akademi Digital Bandung</w:t>
       </w:r>
     </w:p>
     <w:p>
@@ -5061,7 +5061,7 @@
           <w:sz w:val="18"/>
           <w:szCs w:val="18"/>
         </w:rPr>
-        <w:t xml:space="preserve">Data Analytics Workshop Trainer</w:t>
+        <w:t xml:space="preserve">Basic Programming Workshop Trainer</w:t>
       </w:r>
       <w:r>
         <w:t xml:space="preserve">	</w:t>
@@ -5072,7 +5072,7 @@
           <w:sz w:val="16"/>
           <w:szCs w:val="16"/>
         </w:rPr>
-        <w:t xml:space="preserve">Jun 2024</w:t>
+        <w:t xml:space="preserve">Mar 2025</w:t>
       </w:r>
     </w:p>
     <w:p>
@@ -5085,7 +5085,7 @@
           <w:sz w:val="16"/>
           <w:szCs w:val="16"/>
         </w:rPr>
-        <w:t xml:space="preserve">PT Cerebrum Edukasiesia Nusantara</w:t>
+        <w:t xml:space="preserve">Personal Charity Project</w:t>
       </w:r>
     </w:p>
     <w:p>
@@ -5103,7 +5103,7 @@
           <w:sz w:val="18"/>
           <w:szCs w:val="18"/>
         </w:rPr>
-        <w:t xml:space="preserve">Data Analytics Workshop Trainer</w:t>
+        <w:t xml:space="preserve">Speaker at BOOST YOUR BUSINESS: AI UNTUK UMKM NAIK KELAS</w:t>
       </w:r>
       <w:r>
         <w:t xml:space="preserve">	</w:t>
@@ -5114,7 +5114,7 @@
           <w:sz w:val="16"/>
           <w:szCs w:val="16"/>
         </w:rPr>
-        <w:t xml:space="preserve">Mar 2024</w:t>
+        <w:t xml:space="preserve">Dec 2024</w:t>
       </w:r>
     </w:p>
     <w:p>
@@ -5127,7 +5127,7 @@
           <w:sz w:val="16"/>
           <w:szCs w:val="16"/>
         </w:rPr>
-        <w:t xml:space="preserve">Jasa Raharja BOD Candidate by Linxbrain</w:t>
+        <w:t xml:space="preserve">Pengmas Akademi Digital Bandung</w:t>
       </w:r>
     </w:p>
     <w:p>
@@ -5145,7 +5145,7 @@
           <w:sz w:val="18"/>
           <w:szCs w:val="18"/>
         </w:rPr>
-        <w:t xml:space="preserve">Data Analytics Workshop Trainer</w:t>
+        <w:t xml:space="preserve">Conference Moderator</w:t>
       </w:r>
       <w:r>
         <w:t xml:space="preserve">	</w:t>
@@ -5156,7 +5156,7 @@
           <w:sz w:val="16"/>
           <w:szCs w:val="16"/>
         </w:rPr>
-        <w:t xml:space="preserve">Dec 2023</w:t>
+        <w:t xml:space="preserve">Sep 2024</w:t>
       </w:r>
     </w:p>
     <w:p>
@@ -5169,7 +5169,7 @@
           <w:sz w:val="16"/>
           <w:szCs w:val="16"/>
         </w:rPr>
-        <w:t xml:space="preserve">Diskominfo Employee by Enclave Kolaborasi Global</w:t>
+        <w:t xml:space="preserve">International Conference on ICT for Smart Society by ITB</w:t>
       </w:r>
     </w:p>
     <w:p>
@@ -5198,7 +5198,7 @@
           <w:sz w:val="16"/>
           <w:szCs w:val="16"/>
         </w:rPr>
-        <w:t xml:space="preserve">Sep 2023</w:t>
+        <w:t xml:space="preserve">Jun 2024</w:t>
       </w:r>
     </w:p>
     <w:p>
@@ -5211,7 +5211,7 @@
           <w:sz w:val="16"/>
           <w:szCs w:val="16"/>
         </w:rPr>
-        <w:t xml:space="preserve">FEUNM</w:t>
+        <w:t xml:space="preserve">PT Cerebrum Edukasiesia Nusantara</w:t>
       </w:r>
     </w:p>
     <w:p>
@@ -5240,7 +5240,7 @@
           <w:sz w:val="16"/>
           <w:szCs w:val="16"/>
         </w:rPr>
-        <w:t xml:space="preserve">Aug 2023</w:t>
+        <w:t xml:space="preserve">Mar 2024</w:t>
       </w:r>
     </w:p>
     <w:p>
@@ -5253,7 +5253,7 @@
           <w:sz w:val="16"/>
           <w:szCs w:val="16"/>
         </w:rPr>
-        <w:t xml:space="preserve">Diskominfo Employee</w:t>
+        <w:t xml:space="preserve">Jasa Raharja BOD Candidate by Linxbrain</w:t>
       </w:r>
     </w:p>
     <w:p>
@@ -5271,7 +5271,7 @@
           <w:sz w:val="18"/>
           <w:szCs w:val="18"/>
         </w:rPr>
-        <w:t xml:space="preserve">Webinar Speaker in AI Topic</w:t>
+        <w:t xml:space="preserve">Data Analytics Workshop Trainer</w:t>
       </w:r>
       <w:r>
         <w:t xml:space="preserve">	</w:t>
@@ -5282,7 +5282,7 @@
           <w:sz w:val="16"/>
           <w:szCs w:val="16"/>
         </w:rPr>
-        <w:t xml:space="preserve">Jul 2023</w:t>
+        <w:t xml:space="preserve">Dec 2023</w:t>
       </w:r>
     </w:p>
     <w:p>
@@ -5295,7 +5295,7 @@
           <w:sz w:val="16"/>
           <w:szCs w:val="16"/>
         </w:rPr>
-        <w:t xml:space="preserve">UNIBI</w:t>
+        <w:t xml:space="preserve">Diskominfo Employee by Enclave Kolaborasi Global</w:t>
       </w:r>
     </w:p>
     <w:p>
@@ -5313,7 +5313,7 @@
           <w:sz w:val="18"/>
           <w:szCs w:val="18"/>
         </w:rPr>
-        <w:t xml:space="preserve">IoT Trainer</w:t>
+        <w:t xml:space="preserve">Data Analytics Workshop Trainer</w:t>
       </w:r>
       <w:r>
         <w:t xml:space="preserve">	</w:t>
@@ -5324,7 +5324,7 @@
           <w:sz w:val="16"/>
           <w:szCs w:val="16"/>
         </w:rPr>
-        <w:t xml:space="preserve">Feb 2023</w:t>
+        <w:t xml:space="preserve">Sep 2023</w:t>
       </w:r>
     </w:p>
     <w:p>
@@ -5337,7 +5337,7 @@
           <w:sz w:val="16"/>
           <w:szCs w:val="16"/>
         </w:rPr>
-        <w:t xml:space="preserve">SMKN 2 Sukoharjo</w:t>
+        <w:t xml:space="preserve">FEUNM</w:t>
       </w:r>
     </w:p>
     <w:p>
@@ -5355,7 +5355,7 @@
           <w:sz w:val="18"/>
           <w:szCs w:val="18"/>
         </w:rPr>
-        <w:t xml:space="preserve">Back Office Trainer</w:t>
+        <w:t xml:space="preserve">Data Analytics Workshop Trainer</w:t>
       </w:r>
       <w:r>
         <w:t xml:space="preserve">	</w:t>
@@ -5366,7 +5366,7 @@
           <w:sz w:val="16"/>
           <w:szCs w:val="16"/>
         </w:rPr>
-        <w:t xml:space="preserve">Jan 2023</w:t>
+        <w:t xml:space="preserve">Aug 2023</w:t>
       </w:r>
     </w:p>
     <w:p>
@@ -5379,7 +5379,7 @@
           <w:sz w:val="16"/>
           <w:szCs w:val="16"/>
         </w:rPr>
-        <w:t xml:space="preserve">Daarut Tauhid Boarding School for Female</w:t>
+        <w:t xml:space="preserve">Diskominfo Employee</w:t>
       </w:r>
     </w:p>
     <w:p>
@@ -5397,7 +5397,7 @@
           <w:sz w:val="18"/>
           <w:szCs w:val="18"/>
         </w:rPr>
-        <w:t xml:space="preserve">Data Science Trainer</w:t>
+        <w:t xml:space="preserve">Webinar Speaker in AI Topic</w:t>
       </w:r>
       <w:r>
         <w:t xml:space="preserve">	</w:t>
@@ -5408,7 +5408,7 @@
           <w:sz w:val="16"/>
           <w:szCs w:val="16"/>
         </w:rPr>
-        <w:t xml:space="preserve">Aug 2022</w:t>
+        <w:t xml:space="preserve">Jul 2023</w:t>
       </w:r>
     </w:p>
     <w:p>
@@ -5421,7 +5421,7 @@
           <w:sz w:val="16"/>
           <w:szCs w:val="16"/>
         </w:rPr>
-        <w:t xml:space="preserve">HMP PL ITB Komisariat 2022/2023</w:t>
+        <w:t xml:space="preserve">UNIBI</w:t>
       </w:r>
     </w:p>
     <w:p>
@@ -5439,7 +5439,7 @@
           <w:sz w:val="18"/>
           <w:szCs w:val="18"/>
         </w:rPr>
-        <w:t xml:space="preserve">Excel Trainer</w:t>
+        <w:t xml:space="preserve">IoT Trainer</w:t>
       </w:r>
       <w:r>
         <w:t xml:space="preserve">	</w:t>
@@ -5450,7 +5450,7 @@
           <w:sz w:val="16"/>
           <w:szCs w:val="16"/>
         </w:rPr>
-        <w:t xml:space="preserve">Nov 2020</w:t>
+        <w:t xml:space="preserve">Feb 2023</w:t>
       </w:r>
     </w:p>
     <w:p>
@@ -5463,7 +5463,7 @@
           <w:sz w:val="16"/>
           <w:szCs w:val="16"/>
         </w:rPr>
-        <w:t xml:space="preserve">Daarut Tauhid Boarding School Civitas Upgrading</w:t>
+        <w:t xml:space="preserve">SMKN 2 Sukoharjo</w:t>
       </w:r>
     </w:p>
     <w:p>
@@ -5481,7 +5481,7 @@
           <w:sz w:val="18"/>
           <w:szCs w:val="18"/>
         </w:rPr>
-        <w:t xml:space="preserve">IoT Facilitator</w:t>
+        <w:t xml:space="preserve">Back Office Trainer</w:t>
       </w:r>
       <w:r>
         <w:t xml:space="preserve">	</w:t>
@@ -5492,7 +5492,7 @@
           <w:sz w:val="16"/>
           <w:szCs w:val="16"/>
         </w:rPr>
-        <w:t xml:space="preserve">Sep 2019</w:t>
+        <w:t xml:space="preserve">Jan 2023</w:t>
       </w:r>
     </w:p>
     <w:p>
@@ -5505,7 +5505,7 @@
           <w:sz w:val="16"/>
           <w:szCs w:val="16"/>
         </w:rPr>
-        <w:t xml:space="preserve">Digital Talent Program by Kominfo at ITB</w:t>
+        <w:t xml:space="preserve">Daarut Tauhid Boarding School for Female</w:t>
       </w:r>
     </w:p>
     <w:p>
@@ -5523,7 +5523,7 @@
           <w:sz w:val="18"/>
           <w:szCs w:val="18"/>
         </w:rPr>
-        <w:t xml:space="preserve">IoT Facilitator</w:t>
+        <w:t xml:space="preserve">Data Science Trainer</w:t>
       </w:r>
       <w:r>
         <w:t xml:space="preserve">	</w:t>
@@ -5534,7 +5534,7 @@
           <w:sz w:val="16"/>
           <w:szCs w:val="16"/>
         </w:rPr>
-        <w:t xml:space="preserve">Jul 2019</w:t>
+        <w:t xml:space="preserve">Aug 2022</w:t>
       </w:r>
     </w:p>
     <w:p>
@@ -5547,7 +5547,7 @@
           <w:sz w:val="16"/>
           <w:szCs w:val="16"/>
         </w:rPr>
-        <w:t xml:space="preserve">Digital Talent Program by Kominfo at ITB</w:t>
+        <w:t xml:space="preserve">HMP PL ITB Komisariat 2022/2023</w:t>
       </w:r>
     </w:p>
     <w:p>
@@ -5565,7 +5565,7 @@
           <w:sz w:val="18"/>
           <w:szCs w:val="18"/>
         </w:rPr>
-        <w:t xml:space="preserve">FGD Speaker: Fundamental AI and IoT</w:t>
+        <w:t xml:space="preserve">Excel Trainer</w:t>
       </w:r>
       <w:r>
         <w:t xml:space="preserve">	</w:t>
@@ -5576,7 +5576,7 @@
           <w:sz w:val="16"/>
           <w:szCs w:val="16"/>
         </w:rPr>
-        <w:t xml:space="preserve">Oct 2025</w:t>
+        <w:t xml:space="preserve">Nov 2020</w:t>
       </w:r>
     </w:p>
     <w:p>
@@ -5589,7 +5589,7 @@
           <w:sz w:val="16"/>
           <w:szCs w:val="16"/>
         </w:rPr>
-        <w:t xml:space="preserve">Politeknik Negeri Cilacap</w:t>
+        <w:t xml:space="preserve">Daarut Tauhid Boarding School Civitas Upgrading</w:t>
       </w:r>
     </w:p>
     <w:p>
@@ -5607,7 +5607,7 @@
           <w:sz w:val="18"/>
           <w:szCs w:val="18"/>
         </w:rPr>
-        <w:t xml:space="preserve">IoT, Data Science, and AI Private Teacher</w:t>
+        <w:t xml:space="preserve">IoT Facilitator</w:t>
       </w:r>
       <w:r>
         <w:t xml:space="preserve">	</w:t>
@@ -5618,7 +5618,7 @@
           <w:sz w:val="16"/>
           <w:szCs w:val="16"/>
         </w:rPr>
-        <w:t xml:space="preserve">Present</w:t>
+        <w:t xml:space="preserve">Sep 2019</w:t>
       </w:r>
     </w:p>
     <w:p>
@@ -5631,7 +5631,7 @@
           <w:sz w:val="16"/>
           <w:szCs w:val="16"/>
         </w:rPr>
-        <w:t xml:space="preserve">UNSIA Student</w:t>
+        <w:t xml:space="preserve">Digital Talent Program by Kominfo at ITB</w:t>
       </w:r>
     </w:p>
     <w:p>
@@ -5649,7 +5649,7 @@
           <w:sz w:val="18"/>
           <w:szCs w:val="18"/>
         </w:rPr>
-        <w:t xml:space="preserve">IT Teacher for Singapore Intercultural School Student</w:t>
+        <w:t xml:space="preserve">IoT Facilitator</w:t>
       </w:r>
       <w:r>
         <w:t xml:space="preserve">	</w:t>
@@ -5660,7 +5660,7 @@
           <w:sz w:val="16"/>
           <w:szCs w:val="16"/>
         </w:rPr>
-        <w:t xml:space="preserve">Present</w:t>
+        <w:t xml:space="preserve">Jul 2019</w:t>
       </w:r>
     </w:p>
     <w:p>
@@ -5673,7 +5673,7 @@
           <w:sz w:val="16"/>
           <w:szCs w:val="16"/>
         </w:rPr>
-        <w:t xml:space="preserve">Singapore Intercultural School Student</w:t>
+        <w:t xml:space="preserve">Digital Talent Program by Kominfo at ITB</w:t>
       </w:r>
     </w:p>
     <w:sectPr>

</xml_diff>